<commit_message>
Durably restage corrected Manual 03 publication package
</commit_message>
<xml_diff>
--- a/01-foundations/NIST_AI_RMF_1.0/publication/Manual_03_NIST_AI_RMF_Implementation_EN.docx
+++ b/01-foundations/NIST_AI_RMF_1.0/publication/Manual_03_NIST_AI_RMF_Implementation_EN.docx
@@ -6,12 +6,11 @@
       <w:pPr>
         <w:pStyle w:val="Title"/>
         <w:jc w:val="center"/>
-      </w:pPr>
-      <w:r>
-        <w:rPr>
-          <w:rFonts w:ascii="Arial" w:hAnsi="Arial" w:eastAsia="Arial"/>
-          <w:b/>
-          <w:sz w:val="44"/>
+        <w:keepLines/>
+      </w:pPr>
+      <w:r>
+        <w:rPr>
+          <w:rFonts w:ascii="Arial" w:hAnsi="Arial" w:eastAsia="Arial"/>
           <w:lang w:val="en-US"/>
         </w:rPr>
         <w:t>Manual 03 - NIST AI Risk Management Framework Implementation</w:t>
@@ -20,12 +19,11 @@
     <w:p>
       <w:pPr>
         <w:jc w:val="center"/>
-      </w:pPr>
-      <w:r>
-        <w:rPr>
-          <w:rFonts w:ascii="Arial" w:hAnsi="Arial" w:eastAsia="Arial"/>
-          <w:b/>
-          <w:sz w:val="20"/>
+        <w:keepLines/>
+      </w:pPr>
+      <w:r>
+        <w:rPr>
+          <w:rFonts w:ascii="Arial" w:hAnsi="Arial" w:eastAsia="Arial"/>
           <w:lang w:val="en-US"/>
         </w:rPr>
         <w:t>CONTROLLED PUBLICATION QA CANDIDATE</w:t>
@@ -34,25 +32,24 @@
     <w:p>
       <w:pPr>
         <w:jc w:val="center"/>
-      </w:pPr>
-      <w:r>
-        <w:rPr>
-          <w:rFonts w:ascii="Arial" w:hAnsi="Arial" w:eastAsia="Arial"/>
-          <w:sz w:val="17"/>
-          <w:lang w:val="en-US"/>
-        </w:rPr>
-        <w:t>Controlled source revision: 0c5e219dcca52266f6ea60d24fd16690df0de575 | Language: en | NIST AI RMF 1.0 / NIST AI 100-1 baseline; version-aware and subject to source-watch controls.</w:t>
+        <w:keepLines/>
+      </w:pPr>
+      <w:r>
+        <w:rPr>
+          <w:rFonts w:ascii="Arial" w:hAnsi="Arial" w:eastAsia="Arial"/>
+          <w:lang w:val="en-US"/>
+        </w:rPr>
+        <w:t>Controlled source revision: 415cb1bb4afcda24109137eca1d6890462458cd8 | Language: en | NIST AI RMF 1.0 / NIST AI 100-1 baseline; version-aware and subject to source-watch controls.</w:t>
       </w:r>
     </w:p>
     <w:p>
       <w:pPr>
         <w:ind w:left="288" w:right="288"/>
-      </w:pPr>
-      <w:r>
-        <w:rPr>
-          <w:rFonts w:ascii="Arial" w:hAnsi="Arial" w:eastAsia="Arial"/>
-          <w:b/>
-          <w:sz w:val="18"/>
+        <w:keepLines/>
+      </w:pPr>
+      <w:r>
+        <w:rPr>
+          <w:rFonts w:ascii="Arial" w:hAnsi="Arial" w:eastAsia="Arial"/>
           <w:lang w:val="en-US"/>
         </w:rPr>
         <w:t>Assurance boundary: This practical implementation manual does not certify an AI system, establish legal compliance, prove trustworthy-AI achievement, or provide an audit opinion.</w:t>
@@ -2597,7 +2594,7 @@
           <w:rFonts w:ascii="Arial" w:hAnsi="Arial" w:eastAsia="Arial"/>
           <w:lang w:val="en-US"/>
         </w:rPr>
-        <w:t>Assurance boundary: Passing the Manual 03 repository gate will validate controlled structure, source state, accessibility and evidence expectations. It will not certify an organization, determine legal compliance, guarantee trustworthy AI, eliminate risk or constitute an audit opinion.</w:t>
+        <w:t>Assurance boundary: This practical implementation manual does not certify an AI system, establish legal compliance, prove trustworthy-AI achievement, or provide an audit opinion.</w:t>
       </w:r>
     </w:p>
     <w:p>

</xml_diff>